<commit_message>
Kim11-2-6-Suyun-Otoiyonizasyonu: gorsel alanlarina Shutter onizlemeleri yerlestirildi (2.3 bicimi)
</commit_message>
<xml_diff>
--- a/Kim11-2-6-Suyun-Otoiyonizasyonu.docx
+++ b/Kim11-2-6-Suyun-Otoiyonizasyonu.docx
@@ -22,165 +22,113 @@
         <w:t xml:space="preserve">BÖLÜM: Asit ve Baz Çözeltilerinde Denge</w:t>
       </w:r>
     </w:p>
-    <w:tbl>
-      <w:tblPr>
-        <w:tblW w:w="9000" w:type="dxa"/>
+    <w:p>
+      <w:pPr>
         <w:jc w:val="center"/>
-        <w:tblBorders>
-          <w:top w:val="single" w:sz="8" w:space="0" w:color="7F7F7F"/>
-          <w:left w:val="single" w:sz="8" w:space="0" w:color="7F7F7F"/>
-          <w:bottom w:val="single" w:sz="8" w:space="0" w:color="7F7F7F"/>
-          <w:right w:val="single" w:sz="8" w:space="0" w:color="7F7F7F"/>
-        </w:tblBorders>
-      </w:tblPr>
-      <w:tblGrid>
-        <w:gridCol w:w="9000"/>
-      </w:tblGrid>
-      <w:tr>
-        <w:tc>
-          <w:tcPr>
-            <w:tcW w:w="9000" w:type="dxa"/>
-            <w:shd w:val="clear" w:color="auto" w:fill="EDEDED"/>
-          </w:tcPr>
-          <w:p>
-            <w:pPr>
-              <w:jc w:val="both"/>
-              <w:rPr>
-                <w:rFonts w:ascii="Times New Roman" w:hAnsi="Times New Roman" w:cs="Times New Roman"/>
-                <w:lang w:val="tr-TR"/>
-              </w:rPr>
-            </w:pPr>
-            <w:r>
-              <w:rPr>
-                <w:rFonts w:ascii="Times New Roman" w:hAnsi="Times New Roman" w:cs="Times New Roman"/>
-                <w:lang w:val="tr-TR"/>
-              </w:rPr>
-              <w:t xml:space="preserve">GÖRSEL ALANI (Bölüm kapağı, tam sayfa; Shutterstock)</w:t>
-            </w:r>
-          </w:p>
-          <w:p>
-            <w:pPr>
-              <w:jc w:val="both"/>
-              <w:rPr>
-                <w:rFonts w:ascii="Times New Roman" w:hAnsi="Times New Roman" w:cs="Times New Roman"/>
-                <w:lang w:val="tr-TR"/>
-              </w:rPr>
-            </w:pPr>
-            <w:r>
-              <w:rPr>
-                <w:rFonts w:ascii="Times New Roman" w:hAnsi="Times New Roman" w:cs="Times New Roman"/>
-                <w:lang w:val="tr-TR"/>
-              </w:rPr>
-              <w:t xml:space="preserve">Tarif: Limon, sirke, portakal, sabun, çamaşır suyu ve mide ilacı gibi günlük hayatta kullanılan asidik ve bazik ürünlerin bir arada düzenlendiği renkli bir kompozisyon; marka ve logo görünmesin (tam sayfa bölüm kapağı).</w:t>
-            </w:r>
-          </w:p>
-          <w:p>
-            <w:pPr>
-              <w:jc w:val="both"/>
-              <w:rPr>
-                <w:rFonts w:ascii="Times New Roman" w:hAnsi="Times New Roman" w:cs="Times New Roman"/>
-                <w:lang w:val="tr-TR"/>
-              </w:rPr>
-            </w:pPr>
-            <w:r>
-              <w:rPr>
-                <w:rFonts w:ascii="Times New Roman" w:hAnsi="Times New Roman" w:cs="Times New Roman"/>
-                <w:lang w:val="tr-TR"/>
-              </w:rPr>
-              <w:t xml:space="preserve">Shutter ID: 2388261405 (fotoğraf) — Jar with baking soda, bottle of vinegar and lemon</w:t>
-            </w:r>
-          </w:p>
-        </w:tc>
-      </w:tr>
-    </w:tbl>
+      </w:pPr>
+      <w:r>
+        <w:drawing>
+          <wp:inline xmlns:a="http://schemas.openxmlformats.org/drawingml/2006/main" xmlns:pic="http://schemas.openxmlformats.org/drawingml/2006/picture">
+            <wp:extent cx="3777300" cy="4320000"/>
+            <wp:docPr id="900011" name="Picture 900011"/>
+            <wp:cNvGraphicFramePr>
+              <a:graphicFrameLocks noChangeAspect="1"/>
+            </wp:cNvGraphicFramePr>
+            <a:graphic>
+              <a:graphicData uri="http://schemas.openxmlformats.org/drawingml/2006/picture">
+                <pic:pic>
+                  <pic:nvPicPr>
+                    <pic:cNvPr id="0" name="2388261405_d.jpg"/>
+                    <pic:cNvPicPr/>
+                  </pic:nvPicPr>
+                  <pic:blipFill>
+                    <a:blip r:embed="rId11"/>
+                    <a:stretch>
+                      <a:fillRect/>
+                    </a:stretch>
+                  </pic:blipFill>
+                  <pic:spPr>
+                    <a:xfrm>
+                      <a:off x="0" y="0"/>
+                      <a:ext cx="3777300" cy="4320000"/>
+                    </a:xfrm>
+                    <a:prstGeom prst="rect"/>
+                  </pic:spPr>
+                </pic:pic>
+              </a:graphicData>
+            </a:graphic>
+          </wp:inline>
+        </w:drawing>
+      </w:r>
+    </w:p>
     <w:p>
       <w:pPr>
-        <w:jc w:val="both"/>
-        <w:rPr>
-          <w:rFonts w:ascii="Times New Roman" w:hAnsi="Times New Roman" w:cs="Times New Roman"/>
-          <w:lang w:val="tr-TR"/>
-        </w:rPr>
-      </w:pPr>
+        <w:jc w:val="center"/>
+      </w:pPr>
+      <w:r>
+        <w:rPr>
+          <w:rFonts w:ascii="Times New Roman" w:hAnsi="Times New Roman" w:cs="Times New Roman"/>
+          <w:b/>
+          <w:bCs/>
+          <w:highlight w:val="yellow"/>
+          <w:lang w:val="tr-TR"/>
+        </w:rPr>
+        <w:t xml:space="preserve">Shutter id: 2388261405 (bölüm kapağı, tam sayfa)</w:t>
+      </w:r>
     </w:p>
-    <w:tbl>
-      <w:tblPr>
-        <w:tblW w:w="9000" w:type="dxa"/>
+    <w:p>
+      <w:pPr>
         <w:jc w:val="center"/>
-        <w:tblBorders>
-          <w:top w:val="single" w:sz="8" w:space="0" w:color="7F7F7F"/>
-          <w:left w:val="single" w:sz="8" w:space="0" w:color="7F7F7F"/>
-          <w:bottom w:val="single" w:sz="8" w:space="0" w:color="7F7F7F"/>
-          <w:right w:val="single" w:sz="8" w:space="0" w:color="7F7F7F"/>
-        </w:tblBorders>
-      </w:tblPr>
-      <w:tblGrid>
-        <w:gridCol w:w="9000"/>
-      </w:tblGrid>
-      <w:tr>
-        <w:tc>
-          <w:tcPr>
-            <w:tcW w:w="9000" w:type="dxa"/>
-            <w:shd w:val="clear" w:color="auto" w:fill="EDEDED"/>
-          </w:tcPr>
-          <w:p>
-            <w:pPr>
-              <w:jc w:val="both"/>
-              <w:rPr>
-                <w:rFonts w:ascii="Times New Roman" w:hAnsi="Times New Roman" w:cs="Times New Roman"/>
-                <w:lang w:val="tr-TR"/>
-              </w:rPr>
-            </w:pPr>
-            <w:r>
-              <w:rPr>
-                <w:rFonts w:ascii="Times New Roman" w:hAnsi="Times New Roman" w:cs="Times New Roman"/>
-                <w:lang w:val="tr-TR"/>
-              </w:rPr>
-              <w:t xml:space="preserve">GÖRSEL ALANI (Shutterstock)</w:t>
-            </w:r>
-          </w:p>
-          <w:p>
-            <w:pPr>
-              <w:jc w:val="both"/>
-              <w:rPr>
-                <w:rFonts w:ascii="Times New Roman" w:hAnsi="Times New Roman" w:cs="Times New Roman"/>
-                <w:lang w:val="tr-TR"/>
-              </w:rPr>
-            </w:pPr>
-            <w:r>
-              <w:rPr>
-                <w:rFonts w:ascii="Times New Roman" w:hAnsi="Times New Roman" w:cs="Times New Roman"/>
-                <w:lang w:val="tr-TR"/>
-              </w:rPr>
-              <w:t xml:space="preserve">Tarif: Renkli pH skalası (0-14) üzerinde limon, sirke, domates, süt, saf su, kan, karbonat, sabun, çamaşır suyu gibi maddelerin yerleştirildiği vektörel infografik.</w:t>
-            </w:r>
-          </w:p>
-          <w:p>
-            <w:pPr>
-              <w:jc w:val="both"/>
-              <w:rPr>
-                <w:rFonts w:ascii="Times New Roman" w:hAnsi="Times New Roman" w:cs="Times New Roman"/>
-                <w:lang w:val="tr-TR"/>
-              </w:rPr>
-            </w:pPr>
-            <w:r>
-              <w:rPr>
-                <w:rFonts w:ascii="Times New Roman" w:hAnsi="Times New Roman" w:cs="Times New Roman"/>
-                <w:lang w:val="tr-TR"/>
-              </w:rPr>
-              <w:t xml:space="preserve">Shutter ID: 2378915961 (vektör) — Acid, Base and pH Scale</w:t>
-            </w:r>
-          </w:p>
-        </w:tc>
-      </w:tr>
-    </w:tbl>
+      </w:pPr>
+      <w:r>
+        <w:drawing>
+          <wp:inline xmlns:a="http://schemas.openxmlformats.org/drawingml/2006/main" xmlns:pic="http://schemas.openxmlformats.org/drawingml/2006/picture">
+            <wp:extent cx="2362500" cy="2520000"/>
+            <wp:docPr id="900012" name="Picture 900012"/>
+            <wp:cNvGraphicFramePr>
+              <a:graphicFrameLocks noChangeAspect="1"/>
+            </wp:cNvGraphicFramePr>
+            <a:graphic>
+              <a:graphicData uri="http://schemas.openxmlformats.org/drawingml/2006/picture">
+                <pic:pic>
+                  <pic:nvPicPr>
+                    <pic:cNvPr id="0" name="2378915961_d.jpg"/>
+                    <pic:cNvPicPr/>
+                  </pic:nvPicPr>
+                  <pic:blipFill>
+                    <a:blip r:embed="rId12"/>
+                    <a:stretch>
+                      <a:fillRect/>
+                    </a:stretch>
+                  </pic:blipFill>
+                  <pic:spPr>
+                    <a:xfrm>
+                      <a:off x="0" y="0"/>
+                      <a:ext cx="2362500" cy="2520000"/>
+                    </a:xfrm>
+                    <a:prstGeom prst="rect"/>
+                  </pic:spPr>
+                </pic:pic>
+              </a:graphicData>
+            </a:graphic>
+          </wp:inline>
+        </w:drawing>
+      </w:r>
+    </w:p>
     <w:p>
       <w:pPr>
-        <w:jc w:val="both"/>
-        <w:rPr>
-          <w:rFonts w:ascii="Times New Roman" w:hAnsi="Times New Roman" w:cs="Times New Roman"/>
-          <w:lang w:val="tr-TR"/>
-        </w:rPr>
-      </w:pPr>
+        <w:jc w:val="center"/>
+      </w:pPr>
+      <w:r>
+        <w:rPr>
+          <w:rFonts w:ascii="Times New Roman" w:hAnsi="Times New Roman" w:cs="Times New Roman"/>
+          <w:b/>
+          <w:bCs/>
+          <w:highlight w:val="yellow"/>
+          <w:lang w:val="tr-TR"/>
+        </w:rPr>
+        <w:t xml:space="preserve">Shutter id: 2378915961</w:t>
+      </w:r>
     </w:p>
     <w:p>
       <w:pPr>
@@ -682,77 +630,60 @@
           <w:tcPr>
             <w:tcW w:w="4500" w:type="dxa"/>
           </w:tcPr>
-          <w:tbl>
-            <w:tblPr>
-              <w:tblW w:w="4300" w:type="dxa"/>
+          <w:p>
+            <w:pPr>
               <w:jc w:val="center"/>
-              <w:tblBorders>
-                <w:top w:val="single" w:sz="8" w:space="0" w:color="7F7F7F"/>
-                <w:left w:val="single" w:sz="8" w:space="0" w:color="7F7F7F"/>
-                <w:bottom w:val="single" w:sz="8" w:space="0" w:color="7F7F7F"/>
-                <w:right w:val="single" w:sz="8" w:space="0" w:color="7F7F7F"/>
-              </w:tblBorders>
-            </w:tblPr>
-            <w:tblGrid>
-              <w:gridCol w:w="4300"/>
-            </w:tblGrid>
-            <w:tr>
-              <w:tc>
-                <w:tcPr>
-                  <w:tcW w:w="4300" w:type="dxa"/>
-                  <w:shd w:val="clear" w:color="auto" w:fill="EDEDED"/>
-                </w:tcPr>
-                <w:p>
-                  <w:pPr>
-                    <w:jc w:val="both"/>
-                    <w:rPr>
-                      <w:rFonts w:ascii="Times New Roman" w:hAnsi="Times New Roman" w:cs="Times New Roman"/>
-                      <w:lang w:val="tr-TR"/>
-                    </w:rPr>
-                  </w:pPr>
-                  <w:r>
-                    <w:rPr>
-                      <w:rFonts w:ascii="Times New Roman" w:hAnsi="Times New Roman" w:cs="Times New Roman"/>
-                      <w:lang w:val="tr-TR"/>
-                    </w:rPr>
-                    <w:t xml:space="preserve">GÖRSEL ALANI (Shutterstock)</w:t>
-                  </w:r>
-                </w:p>
-                <w:p>
-                  <w:pPr>
-                    <w:jc w:val="both"/>
-                    <w:rPr>
-                      <w:rFonts w:ascii="Times New Roman" w:hAnsi="Times New Roman" w:cs="Times New Roman"/>
-                      <w:lang w:val="tr-TR"/>
-                    </w:rPr>
-                  </w:pPr>
-                  <w:r>
-                    <w:rPr>
-                      <w:rFonts w:ascii="Times New Roman" w:hAnsi="Times New Roman" w:cs="Times New Roman"/>
-                      <w:lang w:val="tr-TR"/>
-                    </w:rPr>
-                    <w:t xml:space="preserve">Tarif: Laboratuvar tezgâhında saf su (damıtık su) dolu, etiketsiz pisetler.</w:t>
-                  </w:r>
-                </w:p>
-                <w:p>
-                  <w:pPr>
-                    <w:jc w:val="both"/>
-                    <w:rPr>
-                      <w:rFonts w:ascii="Times New Roman" w:hAnsi="Times New Roman" w:cs="Times New Roman"/>
-                      <w:lang w:val="tr-TR"/>
-                    </w:rPr>
-                  </w:pPr>
-                  <w:r>
-                    <w:rPr>
-                      <w:rFonts w:ascii="Times New Roman" w:hAnsi="Times New Roman" w:cs="Times New Roman"/>
-                      <w:lang w:val="tr-TR"/>
-                    </w:rPr>
-                    <w:t xml:space="preserve">Shutter ID: 2259054387 (fotoğraf) — Wash bottles with distilled water in laboratory</w:t>
-                  </w:r>
-                </w:p>
-              </w:tc>
-            </w:tr>
-          </w:tbl>
+            </w:pPr>
+            <w:r>
+              <w:drawing>
+                <wp:inline xmlns:a="http://schemas.openxmlformats.org/drawingml/2006/main" xmlns:pic="http://schemas.openxmlformats.org/drawingml/2006/picture">
+                  <wp:extent cx="2664000" cy="1955376"/>
+                  <wp:docPr id="900013" name="Picture 900013"/>
+                  <wp:cNvGraphicFramePr>
+                    <a:graphicFrameLocks noChangeAspect="1"/>
+                  </wp:cNvGraphicFramePr>
+                  <a:graphic>
+                    <a:graphicData uri="http://schemas.openxmlformats.org/drawingml/2006/picture">
+                      <pic:pic>
+                        <pic:nvPicPr>
+                          <pic:cNvPr id="0" name="2259054387_d.jpg"/>
+                          <pic:cNvPicPr/>
+                        </pic:nvPicPr>
+                        <pic:blipFill>
+                          <a:blip r:embed="rId13"/>
+                          <a:stretch>
+                            <a:fillRect/>
+                          </a:stretch>
+                        </pic:blipFill>
+                        <pic:spPr>
+                          <a:xfrm>
+                            <a:off x="0" y="0"/>
+                            <a:ext cx="2664000" cy="1955376"/>
+                          </a:xfrm>
+                          <a:prstGeom prst="rect"/>
+                        </pic:spPr>
+                      </pic:pic>
+                    </a:graphicData>
+                  </a:graphic>
+                </wp:inline>
+              </w:drawing>
+            </w:r>
+          </w:p>
+          <w:p>
+            <w:pPr>
+              <w:jc w:val="center"/>
+            </w:pPr>
+            <w:r>
+              <w:rPr>
+                <w:rFonts w:ascii="Times New Roman" w:hAnsi="Times New Roman" w:cs="Times New Roman"/>
+                <w:b/>
+                <w:bCs/>
+                <w:highlight w:val="yellow"/>
+                <w:lang w:val="tr-TR"/>
+              </w:rPr>
+              <w:t xml:space="preserve">Shutter id: 2259054387</w:t>
+            </w:r>
+          </w:p>
           <w:p>
             <w:pPr>
               <w:jc w:val="center"/>
@@ -783,77 +714,60 @@
           <w:tcPr>
             <w:tcW w:w="4500" w:type="dxa"/>
           </w:tcPr>
-          <w:tbl>
-            <w:tblPr>
-              <w:tblW w:w="4300" w:type="dxa"/>
+          <w:p>
+            <w:pPr>
               <w:jc w:val="center"/>
-              <w:tblBorders>
-                <w:top w:val="single" w:sz="8" w:space="0" w:color="7F7F7F"/>
-                <w:left w:val="single" w:sz="8" w:space="0" w:color="7F7F7F"/>
-                <w:bottom w:val="single" w:sz="8" w:space="0" w:color="7F7F7F"/>
-                <w:right w:val="single" w:sz="8" w:space="0" w:color="7F7F7F"/>
-              </w:tblBorders>
-            </w:tblPr>
-            <w:tblGrid>
-              <w:gridCol w:w="4300"/>
-            </w:tblGrid>
-            <w:tr>
-              <w:tc>
-                <w:tcPr>
-                  <w:tcW w:w="4300" w:type="dxa"/>
-                  <w:shd w:val="clear" w:color="auto" w:fill="EDEDED"/>
-                </w:tcPr>
-                <w:p>
-                  <w:pPr>
-                    <w:jc w:val="both"/>
-                    <w:rPr>
-                      <w:rFonts w:ascii="Times New Roman" w:hAnsi="Times New Roman" w:cs="Times New Roman"/>
-                      <w:lang w:val="tr-TR"/>
-                    </w:rPr>
-                  </w:pPr>
-                  <w:r>
-                    <w:rPr>
-                      <w:rFonts w:ascii="Times New Roman" w:hAnsi="Times New Roman" w:cs="Times New Roman"/>
-                      <w:lang w:val="tr-TR"/>
-                    </w:rPr>
-                    <w:t xml:space="preserve">GÖRSEL ALANI (Shutterstock)</w:t>
-                  </w:r>
-                </w:p>
-                <w:p>
-                  <w:pPr>
-                    <w:jc w:val="both"/>
-                    <w:rPr>
-                      <w:rFonts w:ascii="Times New Roman" w:hAnsi="Times New Roman" w:cs="Times New Roman"/>
-                      <w:lang w:val="tr-TR"/>
-                    </w:rPr>
-                  </w:pPr>
-                  <w:r>
-                    <w:rPr>
-                      <w:rFonts w:ascii="Times New Roman" w:hAnsi="Times New Roman" w:cs="Times New Roman"/>
-                      <w:lang w:val="tr-TR"/>
-                    </w:rPr>
-                    <w:t xml:space="preserve">Tarif: Bir beherdeki saf suya daldırılmış dijital iletkenlik ölçer (kondüktometre) ya da pH metre; ekranda düşük bir değer okunuyor. Laboratuvar ortamı.</w:t>
-                  </w:r>
-                </w:p>
-                <w:p>
-                  <w:pPr>
-                    <w:jc w:val="both"/>
-                    <w:rPr>
-                      <w:rFonts w:ascii="Times New Roman" w:hAnsi="Times New Roman" w:cs="Times New Roman"/>
-                      <w:lang w:val="tr-TR"/>
-                    </w:rPr>
-                  </w:pPr>
-                  <w:r>
-                    <w:rPr>
-                      <w:rFonts w:ascii="Times New Roman" w:hAnsi="Times New Roman" w:cs="Times New Roman"/>
-                      <w:lang w:val="tr-TR"/>
-                    </w:rPr>
-                    <w:t xml:space="preserve">Shutter ID: 760479283 (fotoğraf) — Conductivity meter in chemical laboratory</w:t>
-                  </w:r>
-                </w:p>
-              </w:tc>
-            </w:tr>
-          </w:tbl>
+            </w:pPr>
+            <w:r>
+              <w:drawing>
+                <wp:inline xmlns:a="http://schemas.openxmlformats.org/drawingml/2006/main" xmlns:pic="http://schemas.openxmlformats.org/drawingml/2006/picture">
+                  <wp:extent cx="2664000" cy="1951824"/>
+                  <wp:docPr id="900014" name="Picture 900014"/>
+                  <wp:cNvGraphicFramePr>
+                    <a:graphicFrameLocks noChangeAspect="1"/>
+                  </wp:cNvGraphicFramePr>
+                  <a:graphic>
+                    <a:graphicData uri="http://schemas.openxmlformats.org/drawingml/2006/picture">
+                      <pic:pic>
+                        <pic:nvPicPr>
+                          <pic:cNvPr id="0" name="760479283_d.jpg"/>
+                          <pic:cNvPicPr/>
+                        </pic:nvPicPr>
+                        <pic:blipFill>
+                          <a:blip r:embed="rId14"/>
+                          <a:stretch>
+                            <a:fillRect/>
+                          </a:stretch>
+                        </pic:blipFill>
+                        <pic:spPr>
+                          <a:xfrm>
+                            <a:off x="0" y="0"/>
+                            <a:ext cx="2664000" cy="1951824"/>
+                          </a:xfrm>
+                          <a:prstGeom prst="rect"/>
+                        </pic:spPr>
+                      </pic:pic>
+                    </a:graphicData>
+                  </a:graphic>
+                </wp:inline>
+              </w:drawing>
+            </w:r>
+          </w:p>
+          <w:p>
+            <w:pPr>
+              <w:jc w:val="center"/>
+            </w:pPr>
+            <w:r>
+              <w:rPr>
+                <w:rFonts w:ascii="Times New Roman" w:hAnsi="Times New Roman" w:cs="Times New Roman"/>
+                <w:b/>
+                <w:bCs/>
+                <w:highlight w:val="yellow"/>
+                <w:lang w:val="tr-TR"/>
+              </w:rPr>
+              <w:t xml:space="preserve">Shutter id: 760479283</w:t>
+            </w:r>
+          </w:p>
           <w:p>
             <w:pPr>
               <w:jc w:val="center"/>

</xml_diff>